<commit_message>
docs: source ancillary statistics and refine forecast caveats
</commit_message>
<xml_diff>
--- a/report/report.docx
+++ b/report/report.docx
@@ -78,7 +78,16 @@
           <w:sz w:val="24"/>
           <w:szCs w:val="22"/>
         </w:rPr>
-        <w:t>本研究预测新加坡统一能源价格（Uniform Singapore Energy Price，USEP）的日均值，比较六个预测模型与两个基准的一日超前表现。</w:t>
+        <w:t>本研究预测新加坡统一能源价格（Uniform Singapore Energy Price，USEP）的日均值，比较六个预测模型与两个基准的一日超前表现</w:t>
+      </w:r>
+      <w:r>
+        <w:rPr>
+          <w:rFonts w:ascii="Times New Roman" w:hAnsi="Times New Roman" w:eastAsia="Songti SC" w:cs="Times New Roman" w:csTheme="minorBidi"/>
+          <w:color w:val="FF0000"/>
+          <w:sz w:val="24"/>
+          <w:szCs w:val="22"/>
+        </w:rPr>
+        <w:t>，</w:t>
       </w:r>
       <w:r>
         <w:rPr>
@@ -18601,24 +18610,7 @@
           <w:sz w:val="24"/>
           <w:szCs w:val="22"/>
         </w:rPr>
-      </w:r>
-      <w:r>
-        <w:rPr>
-          <w:rFonts w:ascii="Times New Roman" w:hAnsi="Times New Roman" w:eastAsia="Songti SC" w:cs="Times New Roman" w:csTheme="minorBidi"/>
-          <w:color w:val="FF0000"/>
-          <w:sz w:val="24"/>
-          <w:szCs w:val="22"/>
-        </w:rPr>
         <w:t>%。2026年主备用价格均值为18.7</w:t>
-      </w:r>
-      <w:r>
-        <w:rPr>
-          <w:rFonts w:ascii="Times New Roman" w:hAnsi="Times New Roman" w:eastAsia="Songti SC" w:cs="Times New Roman" w:csTheme="minorBidi"/>
-          <w:color w:val="FF0000"/>
-          <w:sz w:val="24"/>
-          <w:szCs w:val="22"/>
-        </w:rPr>
-        <w:t>【待核】</w:t>
       </w:r>
       <w:r>
         <w:rPr>
@@ -18636,25 +18628,7 @@
           <w:sz w:val="24"/>
           <w:szCs w:val="22"/>
         </w:rPr>
-        <w:t>【待核】</w:t>
-      </w:r>
-      <w:r>
-        <w:rPr>
-          <w:rFonts w:ascii="Times New Roman" w:hAnsi="Times New Roman" w:eastAsia="Songti SC" w:cs="Times New Roman" w:csTheme="minorBidi"/>
-          <w:color w:val="FF0000"/>
-          <w:sz w:val="24"/>
-          <w:szCs w:val="22"/>
-        </w:rPr>
         <w:t>；应急备用与调频价格在训练期的相关系数为0.85</w:t>
-      </w:r>
-      <w:r>
-        <w:rPr>
-          <w:rFonts w:ascii="Times New Roman" w:hAnsi="Times New Roman" w:eastAsia="Songti SC" w:cs="Times New Roman" w:csTheme="minorBidi"/>
-          <w:color w:val="FF0000"/>
-          <w:sz w:val="24"/>
-          <w:szCs w:val="22"/>
-        </w:rPr>
-        <w:t>【待核】</w:t>
       </w:r>
       <w:r>
         <w:rPr>
@@ -18677,7 +18651,34 @@
           <w:sz w:val="24"/>
           <w:szCs w:val="22"/>
         </w:rPr>
-        <w:t>这四种处理是在看到表 12 中测试期 M2 变差后才设计的，属于看到测试期结果后的探索性检验。</w:t>
+        <w:t>这四种处理是在看到表 12 中测试期 M2 变差后才设计的，属于</w:t>
+      </w:r>
+      <w:r>
+        <w:rPr>
+          <w:rFonts w:ascii="Times New Roman" w:hAnsi="Times New Roman" w:eastAsia="Songti SC" w:cs="Times New Roman" w:csTheme="minorBidi"/>
+          <w:color w:val="FF0000"/>
+          <w:sz w:val="24"/>
+          <w:szCs w:val="22"/>
+        </w:rPr>
+        <w:t>事</w:t>
+      </w:r>
+      <w:r>
+        <w:rPr>
+          <w:rFonts w:ascii="Times New Roman" w:hAnsi="Times New Roman" w:eastAsia="Songti SC" w:cs="Times New Roman" w:csTheme="minorBidi"/>
+          <w:color w:val="FF0000"/>
+          <w:sz w:val="24"/>
+          <w:szCs w:val="22"/>
+        </w:rPr>
+        <w:t>后</w:t>
+      </w:r>
+      <w:r>
+        <w:rPr>
+          <w:rFonts w:ascii="Times New Roman" w:hAnsi="Times New Roman" w:eastAsia="Songti SC" w:cs="Times New Roman" w:csTheme="minorBidi"/>
+          <w:color w:val="FF0000"/>
+          <w:sz w:val="24"/>
+          <w:szCs w:val="22"/>
+        </w:rPr>
+        <w:t>探索性检验。</w:t>
       </w:r>
       <w:r>
         <w:rPr>
@@ -20183,7 +20184,16 @@
           <w:sz w:val="24"/>
           <w:szCs w:val="22"/>
         </w:rPr>
-        <w:t>以 XGBoost 为主：点预测 334.13，80% 区间 286.07—382.19，95% 区间 212.12—456.15 SGD/MWh。测试期实际覆盖率分别为 66.7% 和 88.1%（Intervals 表），低于名义水平，区间可能偏窄。其余模型作为对照，单日结果不能用来比较模型优劣。</w:t>
+        <w:t>以 XGBoost 为主：点预测 334.13，80% 区间 286.07—382.19，95% 区间 212.12—456.15 SGD/MWh。测试期实际覆盖率分别为 66.7% 和 88.1%</w:t>
+      </w:r>
+      <w:r>
+        <w:rPr>
+          <w:rFonts w:ascii="Times New Roman" w:hAnsi="Times New Roman" w:eastAsia="Songti SC" w:cs="Times New Roman" w:csTheme="minorBidi"/>
+          <w:color w:val="FF0000"/>
+          <w:sz w:val="24"/>
+          <w:szCs w:val="22"/>
+        </w:rPr>
+        <w:t>，低于名义水平，区间可能偏窄。其余模型作为对照，单日结果不能用来比较模型优劣。</w:t>
       </w:r>
     </w:p>
     <w:p>
@@ -23984,7 +23994,25 @@
           <w:sz w:val="20"/>
           <w:szCs w:val="20"/>
         </w:rPr>
-        <w:t>注：单位为 SGD/MWh；预测起点为 2026 年 8 月 31 日，阴影为 80%/95% 经验区间，同时列示 Naive 参照线与 9 月 1 日 XGBoost 点预测。资料来源：EMC (n.d.b)，R 输出。</w:t>
+        <w:t>注：单位为 SGD/MWh；预测起点为 2026 年 8 月 31 日，阴影为 80%/95% 经验区间，同时列示 Naive 参照线与 9 月 1 日 XGBoost 点预测。</w:t>
+      </w:r>
+      <w:r>
+        <w:rPr>
+          <w:rFonts w:ascii="Times New Roman" w:hAnsi="Times New Roman" w:eastAsia="Songti SC" w:cs="Times New Roman" w:csTheme="minorBidi"/>
+          <w:color w:val="FF0000"/>
+          <w:sz w:val="20"/>
+          <w:szCs w:val="20"/>
+        </w:rPr>
+        <w:t>区间半径按步长段（1–7、8–14、15–30 天）取值，因此在第 8 天和第 15 天跳宽。</w:t>
+      </w:r>
+      <w:r>
+        <w:rPr>
+          <w:rFonts w:ascii="Times New Roman" w:hAnsi="Times New Roman" w:eastAsia="Songti SC" w:cs="Times New Roman" w:csTheme="minorBidi"/>
+          <w:color w:val="FF0000"/>
+          <w:sz w:val="20"/>
+          <w:szCs w:val="20"/>
+        </w:rPr>
+        <w:t>资料来源：EMC (n.d.b)，R 输出。</w:t>
       </w:r>
     </w:p>
     <w:p>
@@ -24025,6 +24053,15 @@
           <w:szCs w:val="22"/>
         </w:rPr>
         <w:t>SARIMA 存在系统性低估，且步长越长越明显；对称区间未修正偏差。区间基于历史误差，无法预见价格水平突变。回测样本有限，重叠路径也并非相互独立，覆盖率不宜视为未来保证。</w:t>
+      </w:r>
+      <w:r>
+        <w:rPr>
+          <w:rFonts w:ascii="Times New Roman" w:hAnsi="Times New Roman" w:eastAsia="Songti SC" w:cs="Times New Roman" w:csTheme="minorBidi"/>
+          <w:color w:val="FF0000"/>
+          <w:sz w:val="24"/>
+          <w:szCs w:val="22"/>
+        </w:rPr>
+        <w:t>8 月日价波动明显高于 2026 年前几个月，而区间由 2026 年 1–8 月的整体回测误差构造，可能低估近期的不确定性。</w:t>
       </w:r>
     </w:p>
     <w:p>

</xml_diff>